<commit_message>
Actualizacion de archivos Unidad 2
</commit_message>
<xml_diff>
--- a/Unidad 2 Aza/Documentos/Metodos_HTTP Aza.docx
+++ b/Unidad 2 Aza/Documentos/Metodos_HTTP Aza.docx
@@ -735,7 +735,130 @@
           <w:sz w:val="24"/>
           <w:szCs w:val="24"/>
         </w:rPr>
-        <w:t>Por ejemplo, la IP no es válida o falta un campo obligatorio, y el servidor no acepta la petición.</w:t>
+        <w:t xml:space="preserve">Por ejemplo, la IP no es válida o falta un campo obligatorio, y el servidor no </w:t>
+      </w:r>
+      <w:proofErr w:type="spellStart"/>
+      <w:r>
+        <w:rPr>
+          <w:sz w:val="24"/>
+          <w:szCs w:val="24"/>
+        </w:rPr>
+        <w:t>acepta</w:t>
+      </w:r>
+      <w:proofErr w:type="spellEnd"/>
+      <w:r>
+        <w:rPr>
+          <w:sz w:val="24"/>
+          <w:szCs w:val="24"/>
+        </w:rPr>
+        <w:t xml:space="preserve"> la </w:t>
+      </w:r>
+      <w:proofErr w:type="spellStart"/>
+      <w:r>
+        <w:rPr>
+          <w:sz w:val="24"/>
+          <w:szCs w:val="24"/>
+        </w:rPr>
+        <w:t>petición</w:t>
+      </w:r>
+      <w:proofErr w:type="spellEnd"/>
+      <w:r>
+        <w:rPr>
+          <w:sz w:val="24"/>
+          <w:szCs w:val="24"/>
+        </w:rPr>
+        <w:t>.</w:t>
+      </w:r>
+    </w:p>
+    <w:p>
+      <w:pPr>
+        <w:rPr>
+          <w:sz w:val="24"/>
+          <w:szCs w:val="24"/>
+        </w:rPr>
+      </w:pPr>
+      <w:r>
+        <w:rPr>
+          <w:sz w:val="24"/>
+          <w:szCs w:val="24"/>
+        </w:rPr>
+        <w:lastRenderedPageBreak/>
+        <w:drawing>
+          <wp:inline distT="0" distB="0" distL="0" distR="0" wp14:anchorId="7DBB6131" wp14:editId="343BEB86">
+            <wp:extent cx="5486400" cy="3429000"/>
+            <wp:effectExtent l="0" t="0" r="0" b="0"/>
+            <wp:docPr id="1" name="Imagen 1"/>
+            <wp:cNvGraphicFramePr>
+              <a:graphicFrameLocks xmlns:a="http://schemas.openxmlformats.org/drawingml/2006/main" noChangeAspect="1"/>
+            </wp:cNvGraphicFramePr>
+            <a:graphic xmlns:a="http://schemas.openxmlformats.org/drawingml/2006/main">
+              <a:graphicData uri="http://schemas.openxmlformats.org/drawingml/2006/picture">
+                <pic:pic xmlns:pic="http://schemas.openxmlformats.org/drawingml/2006/picture">
+                  <pic:nvPicPr>
+                    <pic:cNvPr id="1" name=""/>
+                    <pic:cNvPicPr/>
+                  </pic:nvPicPr>
+                  <pic:blipFill>
+                    <a:blip r:embed="rId6"/>
+                    <a:stretch>
+                      <a:fillRect/>
+                    </a:stretch>
+                  </pic:blipFill>
+                  <pic:spPr>
+                    <a:xfrm>
+                      <a:off x="0" y="0"/>
+                      <a:ext cx="5486400" cy="3429000"/>
+                    </a:xfrm>
+                    <a:prstGeom prst="rect">
+                      <a:avLst/>
+                    </a:prstGeom>
+                  </pic:spPr>
+                </pic:pic>
+              </a:graphicData>
+            </a:graphic>
+          </wp:inline>
+        </w:drawing>
+      </w:r>
+      <w:r>
+        <w:rPr>
+          <w:sz w:val="24"/>
+          <w:szCs w:val="24"/>
+        </w:rPr>
+        <w:drawing>
+          <wp:inline distT="0" distB="0" distL="0" distR="0" wp14:anchorId="7904BD4D" wp14:editId="3EB4F748">
+            <wp:extent cx="5486400" cy="3429000"/>
+            <wp:effectExtent l="0" t="0" r="0" b="0"/>
+            <wp:docPr id="2" name="Imagen 2"/>
+            <wp:cNvGraphicFramePr>
+              <a:graphicFrameLocks xmlns:a="http://schemas.openxmlformats.org/drawingml/2006/main" noChangeAspect="1"/>
+            </wp:cNvGraphicFramePr>
+            <a:graphic xmlns:a="http://schemas.openxmlformats.org/drawingml/2006/main">
+              <a:graphicData uri="http://schemas.openxmlformats.org/drawingml/2006/picture">
+                <pic:pic xmlns:pic="http://schemas.openxmlformats.org/drawingml/2006/picture">
+                  <pic:nvPicPr>
+                    <pic:cNvPr id="1" name=""/>
+                    <pic:cNvPicPr/>
+                  </pic:nvPicPr>
+                  <pic:blipFill>
+                    <a:blip r:embed="rId7"/>
+                    <a:stretch>
+                      <a:fillRect/>
+                    </a:stretch>
+                  </pic:blipFill>
+                  <pic:spPr>
+                    <a:xfrm>
+                      <a:off x="0" y="0"/>
+                      <a:ext cx="5486400" cy="3429000"/>
+                    </a:xfrm>
+                    <a:prstGeom prst="rect">
+                      <a:avLst/>
+                    </a:prstGeom>
+                  </pic:spPr>
+                </pic:pic>
+              </a:graphicData>
+            </a:graphic>
+          </wp:inline>
+        </w:drawing>
       </w:r>
     </w:p>
     <w:sectPr>
@@ -1236,11 +1359,6 @@
     <w:lsdException w:name="Book Title" w:uiPriority="33" w:qFormat="1"/>
     <w:lsdException w:name="Bibliography" w:semiHidden="1" w:uiPriority="37" w:unhideWhenUsed="1"/>
     <w:lsdException w:name="TOC Heading" w:semiHidden="1" w:uiPriority="39" w:unhideWhenUsed="1" w:qFormat="1"/>
-    <w:lsdException w:name="Plain Table 5" w:semiHidden="1" w:unhideWhenUsed="1"/>
-    <w:lsdException w:name="Grid Table Light" w:semiHidden="1" w:unhideWhenUsed="1"/>
-    <w:lsdException w:name="Grid Table 1 Light" w:semiHidden="1" w:unhideWhenUsed="1"/>
-    <w:lsdException w:name="Grid Table 2" w:semiHidden="1" w:unhideWhenUsed="1"/>
-    <w:lsdException w:name="Grid Table 3" w:semiHidden="1" w:unhideWhenUsed="1"/>
     <w:lsdException w:name="Grid Table 4" w:uiPriority="49"/>
     <w:lsdException w:name="Grid Table 5 Dark" w:uiPriority="50"/>
     <w:lsdException w:name="Grid Table 6 Colorful" w:uiPriority="51"/>

</xml_diff>